<commit_message>
Release 1.2.0: structured conversions, Excel support, form fill, summaries, PWA
- 5 new local tools (35 total): pdf-to-markdown, pdf-to-excel, excel-to-pdf,
  fill-pdf-form, summarize; hand-rolled minification-safe XLSX reader/writer
- PDF-to-Word is now a structured exporter (headings, real tables, lists);
  Word-to-PDF defaults to searchable text-first with visual mode kept
- PWA: installable manifest, icons, offline service worker (engines bypassed)
- Evidence: 117 unit, 267 cross-engine browser, 39 native checks, all green
</commit_message>
<xml_diff>
--- a/public/examples/pdf-to-word/sample-output.docx
+++ b/public/examples/pdf-to-word/sample-output.docx
@@ -4,6 +4,20 @@
   <w:body>
     <w:p>
       <w:pPr>
+        <w:pStyle w:val="Heading2"/>
+      </w:pPr>
+      <w:r>
+        <w:rPr>
+          <w:b/>
+          <w:bCs/>
+          <w:sz w:val="28"/>
+          <w:szCs w:val="28"/>
+        </w:rPr>
+        <w:t xml:space="preserve">PDFORGE public conversion example</w:t>
+      </w:r>
+    </w:p>
+    <w:p>
+      <w:pPr>
         <w:spacing w:after="100"/>
       </w:pPr>
       <w:r>
@@ -11,7 +25,7 @@
           <w:sz w:val="22"/>
           <w:szCs w:val="22"/>
         </w:rPr>
-        <w:t xml:space="preserve">PDFORGE public conversion example</w:t>
+        <w:t xml:space="preserve">SYNTHETIC SAMPLE - NOT A CUSTOMER DOCUMENT</w:t>
       </w:r>
     </w:p>
     <w:p>
@@ -23,7 +37,7 @@
           <w:sz w:val="22"/>
           <w:szCs w:val="22"/>
         </w:rPr>
-        <w:t xml:space="preserve">SYNTHETIC SAMPLE - NOT A CUSTOMER DOCUMENT</w:t>
+        <w:t xml:space="preserve">This PDF contains selectable text.</w:t>
       </w:r>
     </w:p>
     <w:p>
@@ -35,7 +49,7 @@
           <w:sz w:val="22"/>
           <w:szCs w:val="22"/>
         </w:rPr>
-        <w:t xml:space="preserve">This PDF contains selectable text.</w:t>
+        <w:t xml:space="preserve">Convert it to DOCX to edit these words.</w:t>
       </w:r>
     </w:p>
     <w:p>
@@ -47,18 +61,6 @@
           <w:sz w:val="22"/>
           <w:szCs w:val="22"/>
         </w:rPr>
-        <w:t xml:space="preserve">Convert it to DOCX to edit these words.</w:t>
-      </w:r>
-    </w:p>
-    <w:p>
-      <w:pPr>
-        <w:spacing w:after="100"/>
-      </w:pPr>
-      <w:r>
-        <w:rPr>
-          <w:sz w:val="22"/>
-          <w:szCs w:val="22"/>
-        </w:rPr>
         <w:t xml:space="preserve">This sample does not demonstrate complex layout reconstruction.</w:t>
       </w:r>
     </w:p>
@@ -69,12 +71,14 @@
     </w:p>
     <w:p>
       <w:pPr>
-        <w:spacing w:after="100"/>
-      </w:pPr>
-      <w:r>
-        <w:rPr>
-          <w:sz w:val="22"/>
-          <w:szCs w:val="22"/>
+        <w:pStyle w:val="Heading2"/>
+      </w:pPr>
+      <w:r>
+        <w:rPr>
+          <w:b/>
+          <w:bCs/>
+          <w:sz w:val="28"/>
+          <w:szCs w:val="28"/>
         </w:rPr>
         <w:t xml:space="preserve">Second page of the synthetic example</w:t>
       </w:r>

</xml_diff>